<commit_message>
docs in pdf + qrs
</commit_message>
<xml_diff>
--- a/Отчетные документы/Отчет по практике.docx
+++ b/Отчетные документы/Отчет по практике.docx
@@ -612,41 +612,21 @@
         </w:rPr>
         <w:t xml:space="preserve">Зав. кафедрой </w:t>
       </w:r>
-      <w:proofErr w:type="spellStart"/>
-      <w:r>
-        <w:rPr>
-          <w:rFonts w:ascii="Times New Roman" w:hAnsi="Times New Roman"/>
-          <w:sz w:val="26"/>
-          <w:szCs w:val="26"/>
-        </w:rPr>
-        <w:t>ИТиЭО</w:t>
-      </w:r>
-      <w:proofErr w:type="spellEnd"/>
-      <w:r>
-        <w:rPr>
-          <w:rFonts w:ascii="Times New Roman" w:hAnsi="Times New Roman"/>
-          <w:sz w:val="26"/>
-          <w:szCs w:val="26"/>
-        </w:rPr>
-        <w:t xml:space="preserve"> </w:t>
-      </w:r>
-      <w:proofErr w:type="spellStart"/>
-      <w:r>
-        <w:rPr>
-          <w:rFonts w:ascii="Times New Roman" w:hAnsi="Times New Roman"/>
-          <w:sz w:val="26"/>
-          <w:szCs w:val="26"/>
-        </w:rPr>
-        <w:t>д.п.н</w:t>
-      </w:r>
-      <w:proofErr w:type="spellEnd"/>
-      <w:r>
-        <w:rPr>
-          <w:rFonts w:ascii="Times New Roman" w:hAnsi="Times New Roman"/>
-          <w:sz w:val="26"/>
-          <w:szCs w:val="26"/>
-        </w:rPr>
-        <w:t>., проф.</w:t>
+      <w:r>
+        <w:rPr>
+          <w:rFonts w:ascii="Times New Roman" w:hAnsi="Times New Roman"/>
+          <w:sz w:val="26"/>
+          <w:szCs w:val="26"/>
+        </w:rPr>
+        <w:t xml:space="preserve">ИТиЭО </w:t>
+      </w:r>
+      <w:r>
+        <w:rPr>
+          <w:rFonts w:ascii="Times New Roman" w:hAnsi="Times New Roman"/>
+          <w:sz w:val="26"/>
+          <w:szCs w:val="26"/>
+        </w:rPr>
+        <w:t>д.п.н., проф.</w:t>
       </w:r>
     </w:p>
     <w:p>
@@ -745,7 +725,6 @@
         </w:rPr>
         <w:t xml:space="preserve"> кафедры </w:t>
       </w:r>
-      <w:proofErr w:type="spellStart"/>
       <w:r>
         <w:rPr>
           <w:rFonts w:ascii="Times New Roman" w:hAnsi="Times New Roman"/>
@@ -762,7 +741,6 @@
         </w:rPr>
         <w:t>ТиЭО</w:t>
       </w:r>
-      <w:proofErr w:type="spellEnd"/>
     </w:p>
     <w:p>
       <w:pPr>
@@ -808,19 +786,11 @@
         </w:rPr>
         <w:t>(</w:t>
       </w:r>
-      <w:proofErr w:type="spellStart"/>
-      <w:r>
-        <w:rPr>
-          <w:rFonts w:ascii="Times New Roman" w:hAnsi="Times New Roman"/>
-        </w:rPr>
-        <w:t>Копыльцов</w:t>
-      </w:r>
-      <w:proofErr w:type="spellEnd"/>
-      <w:r>
-        <w:rPr>
-          <w:rFonts w:ascii="Times New Roman" w:hAnsi="Times New Roman"/>
-        </w:rPr>
-        <w:t xml:space="preserve"> А.В.</w:t>
+      <w:r>
+        <w:rPr>
+          <w:rFonts w:ascii="Times New Roman" w:hAnsi="Times New Roman"/>
+        </w:rPr>
+        <w:t>Копыльцов А.В.</w:t>
       </w:r>
       <w:r>
         <w:rPr>
@@ -1147,16 +1117,48 @@
           <w:color w:val="000000"/>
         </w:rPr>
       </w:pPr>
-    </w:p>
-    <w:p>
-      <w:pPr>
-        <w:pStyle w:val="a5"/>
-        <w:spacing w:before="0" w:beforeAutospacing="0" w:after="0" w:afterAutospacing="0"/>
+      <w:r>
         <w:rPr>
           <w:rFonts w:eastAsiaTheme="minorHAnsi"/>
-          <w:color w:val="000000"/>
-        </w:rPr>
-      </w:pPr>
+          <w:noProof/>
+          <w:color w:val="000000"/>
+        </w:rPr>
+        <w:drawing>
+          <wp:inline distT="0" distB="0" distL="0" distR="0" wp14:anchorId="1074AA49" wp14:editId="7F33AF38">
+            <wp:extent cx="2880000" cy="2880000"/>
+            <wp:effectExtent l="0" t="0" r="0" b="0"/>
+            <wp:docPr id="1455799580" name="Рисунок 2"/>
+            <wp:cNvGraphicFramePr>
+              <a:graphicFrameLocks xmlns:a="http://schemas.openxmlformats.org/drawingml/2006/main" noChangeAspect="1"/>
+            </wp:cNvGraphicFramePr>
+            <a:graphic xmlns:a="http://schemas.openxmlformats.org/drawingml/2006/main">
+              <a:graphicData uri="http://schemas.openxmlformats.org/drawingml/2006/picture">
+                <pic:pic xmlns:pic="http://schemas.openxmlformats.org/drawingml/2006/picture">
+                  <pic:nvPicPr>
+                    <pic:cNvPr id="1455799580" name="Рисунок 1455799580"/>
+                    <pic:cNvPicPr/>
+                  </pic:nvPicPr>
+                  <pic:blipFill>
+                    <a:blip r:embed="rId7"/>
+                    <a:stretch>
+                      <a:fillRect/>
+                    </a:stretch>
+                  </pic:blipFill>
+                  <pic:spPr>
+                    <a:xfrm>
+                      <a:off x="0" y="0"/>
+                      <a:ext cx="2880000" cy="2880000"/>
+                    </a:xfrm>
+                    <a:prstGeom prst="rect">
+                      <a:avLst/>
+                    </a:prstGeom>
+                  </pic:spPr>
+                </pic:pic>
+              </a:graphicData>
+            </a:graphic>
+          </wp:inline>
+        </w:drawing>
+      </w:r>
     </w:p>
     <w:p>
       <w:pPr>
@@ -1231,6 +1233,339 @@
           <w:color w:val="000000"/>
         </w:rPr>
       </w:pPr>
+      <w:r>
+        <w:rPr>
+          <w:rFonts w:eastAsiaTheme="minorHAnsi"/>
+          <w:noProof/>
+          <w:color w:val="000000"/>
+        </w:rPr>
+        <w:drawing>
+          <wp:inline distT="0" distB="0" distL="0" distR="0" wp14:anchorId="48A3B7DD" wp14:editId="4BD16F27">
+            <wp:extent cx="2880000" cy="2880000"/>
+            <wp:effectExtent l="0" t="0" r="0" b="0"/>
+            <wp:docPr id="1070693336" name="Рисунок 2"/>
+            <wp:cNvGraphicFramePr>
+              <a:graphicFrameLocks xmlns:a="http://schemas.openxmlformats.org/drawingml/2006/main" noChangeAspect="1"/>
+            </wp:cNvGraphicFramePr>
+            <a:graphic xmlns:a="http://schemas.openxmlformats.org/drawingml/2006/main">
+              <a:graphicData uri="http://schemas.openxmlformats.org/drawingml/2006/picture">
+                <pic:pic xmlns:pic="http://schemas.openxmlformats.org/drawingml/2006/picture">
+                  <pic:nvPicPr>
+                    <pic:cNvPr id="1455799580" name="Рисунок 1455799580"/>
+                    <pic:cNvPicPr/>
+                  </pic:nvPicPr>
+                  <pic:blipFill>
+                    <a:blip r:embed="rId7"/>
+                    <a:stretch>
+                      <a:fillRect/>
+                    </a:stretch>
+                  </pic:blipFill>
+                  <pic:spPr>
+                    <a:xfrm>
+                      <a:off x="0" y="0"/>
+                      <a:ext cx="2880000" cy="2880000"/>
+                    </a:xfrm>
+                    <a:prstGeom prst="rect">
+                      <a:avLst/>
+                    </a:prstGeom>
+                  </pic:spPr>
+                </pic:pic>
+              </a:graphicData>
+            </a:graphic>
+          </wp:inline>
+        </w:drawing>
+      </w:r>
+    </w:p>
+    <w:p>
+      <w:pPr>
+        <w:pStyle w:val="11"/>
+        <w:tabs>
+          <w:tab w:val="left" w:pos="1065"/>
+        </w:tabs>
+        <w:spacing w:after="0" w:line="240" w:lineRule="auto"/>
+        <w:jc w:val="both"/>
+        <w:rPr>
+          <w:rFonts w:ascii="Times New Roman" w:eastAsia="Times New Roman" w:hAnsi="Times New Roman" w:cs="Times New Roman"/>
+          <w:sz w:val="24"/>
+          <w:szCs w:val="24"/>
+        </w:rPr>
+      </w:pPr>
+      <w:r>
+        <w:rPr>
+          <w:rFonts w:ascii="Times New Roman" w:eastAsia="Times New Roman" w:hAnsi="Times New Roman" w:cs="Times New Roman"/>
+          <w:b/>
+          <w:sz w:val="24"/>
+          <w:szCs w:val="24"/>
+        </w:rPr>
+        <w:t>Задание 1.2.</w:t>
+      </w:r>
+      <w:r>
+        <w:rPr>
+          <w:b/>
+          <w:color w:val="000000"/>
+        </w:rPr>
+        <w:t xml:space="preserve"> </w:t>
+      </w:r>
+      <w:r>
+        <w:rPr>
+          <w:rFonts w:ascii="Times New Roman" w:eastAsiaTheme="minorHAnsi" w:hAnsi="Times New Roman" w:cs="Times New Roman"/>
+          <w:b/>
+          <w:i/>
+          <w:color w:val="000000"/>
+          <w:sz w:val="24"/>
+          <w:szCs w:val="24"/>
+        </w:rPr>
+        <w:t>Изучение и анализ образовательных порталов (отечественных и зарубежных).</w:t>
+      </w:r>
+    </w:p>
+    <w:p>
+      <w:pPr>
+        <w:spacing w:after="0" w:line="240" w:lineRule="auto"/>
+        <w:jc w:val="both"/>
+        <w:rPr>
+          <w:rFonts w:ascii="Times New Roman" w:eastAsia="Times New Roman" w:hAnsi="Times New Roman"/>
+          <w:b/>
+          <w:i/>
+          <w:color w:val="000000"/>
+          <w:sz w:val="24"/>
+          <w:szCs w:val="24"/>
+          <w:lang w:eastAsia="ru-RU"/>
+        </w:rPr>
+      </w:pPr>
+    </w:p>
+    <w:p>
+      <w:pPr>
+        <w:spacing w:after="0"/>
+        <w:rPr>
+          <w:rFonts w:ascii="Times New Roman" w:eastAsiaTheme="minorHAnsi" w:hAnsi="Times New Roman"/>
+          <w:color w:val="000000"/>
+          <w:sz w:val="24"/>
+          <w:szCs w:val="24"/>
+          <w:lang w:eastAsia="ru-RU"/>
+        </w:rPr>
+      </w:pPr>
+      <w:r>
+        <w:rPr>
+          <w:rFonts w:ascii="Times New Roman" w:eastAsia="Times New Roman" w:hAnsi="Times New Roman"/>
+          <w:color w:val="000000"/>
+          <w:sz w:val="24"/>
+          <w:szCs w:val="24"/>
+          <w:lang w:eastAsia="ru-RU"/>
+        </w:rPr>
+        <w:lastRenderedPageBreak/>
+        <w:t>Примечание:</w:t>
+      </w:r>
+      <w:r>
+        <w:rPr>
+          <w:rFonts w:ascii="Times New Roman" w:eastAsia="Times New Roman" w:hAnsi="Times New Roman"/>
+          <w:b/>
+          <w:i/>
+          <w:color w:val="000000"/>
+          <w:sz w:val="24"/>
+          <w:szCs w:val="24"/>
+          <w:lang w:eastAsia="ru-RU"/>
+        </w:rPr>
+        <w:t xml:space="preserve"> </w:t>
+      </w:r>
+      <w:r>
+        <w:rPr>
+          <w:rFonts w:ascii="Times New Roman" w:eastAsiaTheme="minorHAnsi" w:hAnsi="Times New Roman"/>
+          <w:color w:val="000000"/>
+          <w:sz w:val="24"/>
+          <w:szCs w:val="24"/>
+          <w:lang w:eastAsia="ru-RU"/>
+        </w:rPr>
+        <w:t>Аннотированный список</w:t>
+      </w:r>
+    </w:p>
+    <w:p>
+      <w:pPr>
+        <w:pStyle w:val="11"/>
+        <w:ind w:left="-851" w:firstLine="851"/>
+        <w:rPr>
+          <w:rFonts w:ascii="Times New Roman" w:eastAsia="Times New Roman" w:hAnsi="Times New Roman"/>
+          <w:b/>
+          <w:i/>
+          <w:color w:val="000000"/>
+          <w:sz w:val="28"/>
+          <w:szCs w:val="24"/>
+        </w:rPr>
+      </w:pPr>
+      <w:r>
+        <w:rPr>
+          <w:rFonts w:ascii="Times New Roman" w:eastAsia="Times New Roman" w:hAnsi="Times New Roman"/>
+          <w:i/>
+          <w:sz w:val="24"/>
+        </w:rPr>
+        <w:t>QR-код задания (на GIT-репозиторий):</w:t>
+      </w:r>
+    </w:p>
+    <w:p>
+      <w:pPr>
+        <w:rPr>
+          <w:rFonts w:ascii="Times New Roman" w:eastAsiaTheme="minorHAnsi" w:hAnsi="Times New Roman"/>
+          <w:b/>
+          <w:i/>
+          <w:color w:val="000000"/>
+          <w:sz w:val="24"/>
+          <w:szCs w:val="24"/>
+        </w:rPr>
+      </w:pPr>
+      <w:r>
+        <w:rPr>
+          <w:rFonts w:eastAsiaTheme="minorHAnsi"/>
+          <w:noProof/>
+          <w:color w:val="000000"/>
+        </w:rPr>
+        <w:drawing>
+          <wp:inline distT="0" distB="0" distL="0" distR="0" wp14:anchorId="298FBEEE" wp14:editId="0A9C7852">
+            <wp:extent cx="2880000" cy="2880000"/>
+            <wp:effectExtent l="0" t="0" r="0" b="0"/>
+            <wp:docPr id="1207608265" name="Рисунок 2"/>
+            <wp:cNvGraphicFramePr>
+              <a:graphicFrameLocks xmlns:a="http://schemas.openxmlformats.org/drawingml/2006/main" noChangeAspect="1"/>
+            </wp:cNvGraphicFramePr>
+            <a:graphic xmlns:a="http://schemas.openxmlformats.org/drawingml/2006/main">
+              <a:graphicData uri="http://schemas.openxmlformats.org/drawingml/2006/picture">
+                <pic:pic xmlns:pic="http://schemas.openxmlformats.org/drawingml/2006/picture">
+                  <pic:nvPicPr>
+                    <pic:cNvPr id="1455799580" name="Рисунок 1455799580"/>
+                    <pic:cNvPicPr/>
+                  </pic:nvPicPr>
+                  <pic:blipFill>
+                    <a:blip r:embed="rId7"/>
+                    <a:stretch>
+                      <a:fillRect/>
+                    </a:stretch>
+                  </pic:blipFill>
+                  <pic:spPr>
+                    <a:xfrm>
+                      <a:off x="0" y="0"/>
+                      <a:ext cx="2880000" cy="2880000"/>
+                    </a:xfrm>
+                    <a:prstGeom prst="rect">
+                      <a:avLst/>
+                    </a:prstGeom>
+                  </pic:spPr>
+                </pic:pic>
+              </a:graphicData>
+            </a:graphic>
+          </wp:inline>
+        </w:drawing>
+      </w:r>
+    </w:p>
+    <w:p>
+      <w:pPr>
+        <w:rPr>
+          <w:rFonts w:ascii="Times New Roman" w:eastAsiaTheme="minorHAnsi" w:hAnsi="Times New Roman"/>
+          <w:color w:val="000000"/>
+          <w:sz w:val="24"/>
+          <w:szCs w:val="24"/>
+          <w:lang w:eastAsia="ru-RU"/>
+        </w:rPr>
+      </w:pPr>
+      <w:r>
+        <w:rPr>
+          <w:rFonts w:ascii="Times New Roman" w:eastAsiaTheme="minorHAnsi" w:hAnsi="Times New Roman"/>
+          <w:b/>
+          <w:i/>
+          <w:color w:val="000000"/>
+          <w:sz w:val="24"/>
+          <w:szCs w:val="24"/>
+        </w:rPr>
+        <w:t>По результатам участие и выступление на круглом столе (в формате вебинара), посвященного особенностям и перспективам использования ТЭО в корпоративном обучении</w:t>
+      </w:r>
+    </w:p>
+    <w:p>
+      <w:pPr>
+        <w:pStyle w:val="a5"/>
+        <w:spacing w:before="0" w:beforeAutospacing="0" w:after="0" w:afterAutospacing="0"/>
+        <w:rPr>
+          <w:rFonts w:eastAsiaTheme="minorHAnsi"/>
+          <w:color w:val="000000"/>
+        </w:rPr>
+      </w:pPr>
+      <w:r>
+        <w:rPr>
+          <w:rFonts w:eastAsiaTheme="minorHAnsi"/>
+          <w:color w:val="000000"/>
+        </w:rPr>
+        <w:t>Примечание: Текст выступления</w:t>
+      </w:r>
+    </w:p>
+    <w:p>
+      <w:pPr>
+        <w:pStyle w:val="11"/>
+        <w:ind w:left="-851" w:firstLine="851"/>
+        <w:rPr>
+          <w:rFonts w:ascii="Times New Roman" w:eastAsia="Times New Roman" w:hAnsi="Times New Roman"/>
+          <w:b/>
+          <w:i/>
+          <w:color w:val="000000"/>
+          <w:sz w:val="28"/>
+          <w:szCs w:val="24"/>
+        </w:rPr>
+      </w:pPr>
+      <w:r>
+        <w:rPr>
+          <w:rFonts w:ascii="Times New Roman" w:eastAsia="Times New Roman" w:hAnsi="Times New Roman"/>
+          <w:i/>
+          <w:sz w:val="24"/>
+        </w:rPr>
+        <w:t>QR-код задания (на GIT-репозиторий):</w:t>
+      </w:r>
+    </w:p>
+    <w:p>
+      <w:pPr>
+        <w:pStyle w:val="a5"/>
+        <w:spacing w:before="0" w:beforeAutospacing="0" w:after="0" w:afterAutospacing="0"/>
+        <w:rPr>
+          <w:rFonts w:eastAsiaTheme="minorHAnsi"/>
+          <w:color w:val="000000"/>
+        </w:rPr>
+      </w:pPr>
+      <w:r>
+        <w:rPr>
+          <w:rFonts w:eastAsiaTheme="minorHAnsi"/>
+          <w:noProof/>
+          <w:color w:val="000000"/>
+        </w:rPr>
+        <w:drawing>
+          <wp:inline distT="0" distB="0" distL="0" distR="0" wp14:anchorId="08C06747" wp14:editId="5846BBAD">
+            <wp:extent cx="2880000" cy="2880000"/>
+            <wp:effectExtent l="0" t="0" r="0" b="0"/>
+            <wp:docPr id="551206565" name="Рисунок 2"/>
+            <wp:cNvGraphicFramePr>
+              <a:graphicFrameLocks xmlns:a="http://schemas.openxmlformats.org/drawingml/2006/main" noChangeAspect="1"/>
+            </wp:cNvGraphicFramePr>
+            <a:graphic xmlns:a="http://schemas.openxmlformats.org/drawingml/2006/main">
+              <a:graphicData uri="http://schemas.openxmlformats.org/drawingml/2006/picture">
+                <pic:pic xmlns:pic="http://schemas.openxmlformats.org/drawingml/2006/picture">
+                  <pic:nvPicPr>
+                    <pic:cNvPr id="1455799580" name="Рисунок 1455799580"/>
+                    <pic:cNvPicPr/>
+                  </pic:nvPicPr>
+                  <pic:blipFill>
+                    <a:blip r:embed="rId7"/>
+                    <a:stretch>
+                      <a:fillRect/>
+                    </a:stretch>
+                  </pic:blipFill>
+                  <pic:spPr>
+                    <a:xfrm>
+                      <a:off x="0" y="0"/>
+                      <a:ext cx="2880000" cy="2880000"/>
+                    </a:xfrm>
+                    <a:prstGeom prst="rect">
+                      <a:avLst/>
+                    </a:prstGeom>
+                  </pic:spPr>
+                </pic:pic>
+              </a:graphicData>
+            </a:graphic>
+          </wp:inline>
+        </w:drawing>
+      </w:r>
     </w:p>
     <w:p>
       <w:pPr>
@@ -1238,109 +1573,62 @@
         <w:spacing w:before="0" w:beforeAutospacing="0" w:after="0" w:afterAutospacing="0"/>
         <w:jc w:val="both"/>
         <w:rPr>
-          <w:color w:val="000000"/>
-        </w:rPr>
-      </w:pPr>
-    </w:p>
-    <w:p>
-      <w:pPr>
-        <w:pStyle w:val="11"/>
-        <w:tabs>
-          <w:tab w:val="left" w:pos="1065"/>
-        </w:tabs>
-        <w:spacing w:after="0" w:line="240" w:lineRule="auto"/>
+          <w:rFonts w:eastAsiaTheme="minorHAnsi"/>
+          <w:b/>
+          <w:i/>
+          <w:color w:val="000000"/>
+        </w:rPr>
+      </w:pPr>
+      <w:r>
+        <w:rPr>
+          <w:b/>
+        </w:rPr>
+        <w:t xml:space="preserve">Задание 1.3. </w:t>
+      </w:r>
+      <w:r>
+        <w:rPr>
+          <w:rFonts w:eastAsiaTheme="minorHAnsi"/>
+          <w:b/>
+          <w:i/>
+          <w:color w:val="000000"/>
+        </w:rPr>
+        <w:t>Разработка схем использования технологий электронного обучения при организации и осуществлении корпоративного обучения (на конкретном примере по выбору магистранта).</w:t>
+      </w:r>
+    </w:p>
+    <w:p>
+      <w:pPr>
+        <w:pStyle w:val="a5"/>
+        <w:spacing w:before="0" w:beforeAutospacing="0" w:after="0" w:afterAutospacing="0"/>
         <w:jc w:val="both"/>
         <w:rPr>
-          <w:rFonts w:ascii="Times New Roman" w:eastAsia="Times New Roman" w:hAnsi="Times New Roman" w:cs="Times New Roman"/>
-          <w:sz w:val="24"/>
-          <w:szCs w:val="24"/>
-        </w:rPr>
-      </w:pPr>
-      <w:r>
-        <w:rPr>
-          <w:rFonts w:ascii="Times New Roman" w:eastAsia="Times New Roman" w:hAnsi="Times New Roman" w:cs="Times New Roman"/>
-          <w:b/>
-          <w:sz w:val="24"/>
-          <w:szCs w:val="24"/>
-        </w:rPr>
-        <w:t>Задание 1.2.</w:t>
-      </w:r>
-      <w:r>
-        <w:rPr>
-          <w:b/>
-          <w:color w:val="000000"/>
-        </w:rPr>
-        <w:t xml:space="preserve"> </w:t>
-      </w:r>
-      <w:r>
-        <w:rPr>
-          <w:rFonts w:ascii="Times New Roman" w:eastAsiaTheme="minorHAnsi" w:hAnsi="Times New Roman" w:cs="Times New Roman"/>
-          <w:b/>
-          <w:i/>
-          <w:color w:val="000000"/>
-          <w:sz w:val="24"/>
-          <w:szCs w:val="24"/>
-        </w:rPr>
-        <w:t>Изучение и анализ образовательных порталов (отечественных и зарубежных).</w:t>
-      </w:r>
-    </w:p>
-    <w:p>
-      <w:pPr>
-        <w:spacing w:after="0" w:line="240" w:lineRule="auto"/>
+          <w:rFonts w:ascii="Times" w:eastAsiaTheme="minorHAnsi" w:hAnsi="Times"/>
+          <w:sz w:val="20"/>
+          <w:szCs w:val="20"/>
+        </w:rPr>
+      </w:pPr>
+    </w:p>
+    <w:p>
+      <w:pPr>
+        <w:pStyle w:val="a5"/>
+        <w:spacing w:before="0" w:beforeAutospacing="0" w:after="0" w:afterAutospacing="0"/>
         <w:jc w:val="both"/>
         <w:rPr>
-          <w:rFonts w:ascii="Times New Roman" w:eastAsia="Times New Roman" w:hAnsi="Times New Roman"/>
-          <w:b/>
-          <w:i/>
-          <w:color w:val="000000"/>
-          <w:sz w:val="24"/>
-          <w:szCs w:val="24"/>
-          <w:lang w:eastAsia="ru-RU"/>
-        </w:rPr>
-      </w:pPr>
-    </w:p>
-    <w:p>
-      <w:pPr>
-        <w:spacing w:after="0"/>
-        <w:rPr>
-          <w:rFonts w:ascii="Times New Roman" w:eastAsiaTheme="minorHAnsi" w:hAnsi="Times New Roman"/>
-          <w:color w:val="000000"/>
-          <w:sz w:val="24"/>
-          <w:szCs w:val="24"/>
-          <w:lang w:eastAsia="ru-RU"/>
-        </w:rPr>
-      </w:pPr>
-      <w:r>
-        <w:rPr>
-          <w:rFonts w:ascii="Times New Roman" w:eastAsia="Times New Roman" w:hAnsi="Times New Roman"/>
-          <w:color w:val="000000"/>
-          <w:sz w:val="24"/>
-          <w:szCs w:val="24"/>
-          <w:lang w:eastAsia="ru-RU"/>
-        </w:rPr>
-        <w:t>Примечание:</w:t>
-      </w:r>
-      <w:r>
-        <w:rPr>
-          <w:rFonts w:ascii="Times New Roman" w:eastAsia="Times New Roman" w:hAnsi="Times New Roman"/>
-          <w:b/>
-          <w:i/>
-          <w:color w:val="000000"/>
-          <w:sz w:val="24"/>
-          <w:szCs w:val="24"/>
-          <w:lang w:eastAsia="ru-RU"/>
-        </w:rPr>
-        <w:t xml:space="preserve"> </w:t>
-      </w:r>
-      <w:r>
-        <w:rPr>
-          <w:rFonts w:ascii="Times New Roman" w:eastAsiaTheme="minorHAnsi" w:hAnsi="Times New Roman"/>
-          <w:color w:val="000000"/>
-          <w:sz w:val="24"/>
-          <w:szCs w:val="24"/>
-          <w:lang w:eastAsia="ru-RU"/>
-        </w:rPr>
-        <w:t>Аннотированный список</w:t>
+          <w:rFonts w:eastAsiaTheme="minorHAnsi"/>
+          <w:color w:val="000000"/>
+        </w:rPr>
+      </w:pPr>
+      <w:r>
+        <w:t>Примечание</w:t>
+      </w:r>
+      <w:r>
+        <w:t xml:space="preserve">: </w:t>
+      </w:r>
+      <w:r>
+        <w:rPr>
+          <w:rFonts w:eastAsiaTheme="minorHAnsi"/>
+          <w:color w:val="000000"/>
+        </w:rPr>
+        <w:t>Интеллект-карта</w:t>
       </w:r>
     </w:p>
     <w:p>
@@ -1367,230 +1655,58 @@
     </w:p>
     <w:p>
       <w:pPr>
-        <w:rPr>
-          <w:rFonts w:ascii="Times New Roman" w:eastAsiaTheme="minorHAnsi" w:hAnsi="Times New Roman"/>
-          <w:color w:val="000000"/>
-          <w:sz w:val="24"/>
-          <w:szCs w:val="24"/>
-          <w:lang w:eastAsia="ru-RU"/>
-        </w:rPr>
-      </w:pPr>
-    </w:p>
-    <w:p>
-      <w:pPr>
-        <w:pStyle w:val="11"/>
-        <w:tabs>
-          <w:tab w:val="left" w:pos="1065"/>
-        </w:tabs>
-        <w:spacing w:after="0" w:line="240" w:lineRule="auto"/>
-        <w:jc w:val="both"/>
-        <w:rPr>
-          <w:rFonts w:ascii="Times New Roman" w:eastAsiaTheme="minorHAnsi" w:hAnsi="Times New Roman" w:cs="Times New Roman"/>
-          <w:b/>
-          <w:i/>
-          <w:color w:val="000000"/>
-          <w:sz w:val="24"/>
-          <w:szCs w:val="24"/>
-        </w:rPr>
-      </w:pPr>
-      <w:r>
-        <w:rPr>
-          <w:rFonts w:ascii="Times New Roman" w:eastAsiaTheme="minorHAnsi" w:hAnsi="Times New Roman" w:cs="Times New Roman"/>
-          <w:b/>
-          <w:i/>
-          <w:color w:val="000000"/>
-          <w:sz w:val="24"/>
-          <w:szCs w:val="24"/>
-        </w:rPr>
-        <w:t>По результатам участие и выступление на круглом столе (в формате вебинара), посвященного особенностям и перспективам использования ТЭО в корпоративном обучении</w:t>
-      </w:r>
-    </w:p>
-    <w:p>
-      <w:pPr>
-        <w:pStyle w:val="11"/>
-        <w:tabs>
-          <w:tab w:val="left" w:pos="1065"/>
-        </w:tabs>
-        <w:spacing w:after="0" w:line="240" w:lineRule="auto"/>
-        <w:jc w:val="both"/>
-        <w:rPr>
-          <w:rFonts w:ascii="Times New Roman" w:eastAsiaTheme="minorHAnsi" w:hAnsi="Times New Roman" w:cs="Times New Roman"/>
-          <w:b/>
-          <w:i/>
-          <w:color w:val="000000"/>
-          <w:sz w:val="24"/>
-          <w:szCs w:val="24"/>
-        </w:rPr>
-      </w:pPr>
-    </w:p>
-    <w:p>
-      <w:pPr>
         <w:pStyle w:val="a5"/>
         <w:spacing w:before="0" w:beforeAutospacing="0" w:after="0" w:afterAutospacing="0"/>
-        <w:rPr>
-          <w:rFonts w:eastAsiaTheme="minorHAnsi"/>
-          <w:color w:val="000000"/>
-        </w:rPr>
-      </w:pPr>
-      <w:r>
-        <w:rPr>
-          <w:rFonts w:eastAsiaTheme="minorHAnsi"/>
-          <w:color w:val="000000"/>
-        </w:rPr>
-        <w:t>Примечание: Текст выступления</w:t>
-      </w:r>
-    </w:p>
-    <w:p>
-      <w:pPr>
-        <w:pStyle w:val="11"/>
-        <w:ind w:left="-851" w:firstLine="851"/>
-        <w:rPr>
-          <w:rFonts w:ascii="Times New Roman" w:eastAsia="Times New Roman" w:hAnsi="Times New Roman"/>
-          <w:b/>
-          <w:i/>
-          <w:color w:val="000000"/>
-          <w:sz w:val="28"/>
-          <w:szCs w:val="24"/>
-        </w:rPr>
-      </w:pPr>
-      <w:r>
-        <w:rPr>
-          <w:rFonts w:ascii="Times New Roman" w:eastAsia="Times New Roman" w:hAnsi="Times New Roman"/>
-          <w:i/>
-          <w:sz w:val="24"/>
-        </w:rPr>
-        <w:t>QR-код задания (на GIT-репозиторий):</w:t>
-      </w:r>
-    </w:p>
-    <w:p>
-      <w:pPr>
-        <w:pStyle w:val="a5"/>
-        <w:spacing w:before="0" w:beforeAutospacing="0" w:after="0" w:afterAutospacing="0"/>
-        <w:rPr>
-          <w:rFonts w:eastAsiaTheme="minorHAnsi"/>
-          <w:color w:val="000000"/>
-        </w:rPr>
-      </w:pPr>
-    </w:p>
-    <w:p>
-      <w:pPr>
+        <w:jc w:val="both"/>
         <w:rPr>
           <w:rFonts w:ascii="Times" w:eastAsiaTheme="minorHAnsi" w:hAnsi="Times"/>
           <w:sz w:val="20"/>
           <w:szCs w:val="20"/>
         </w:rPr>
       </w:pPr>
-    </w:p>
-    <w:p>
-      <w:pPr>
-        <w:pStyle w:val="a5"/>
-        <w:spacing w:before="0" w:beforeAutospacing="0" w:after="0" w:afterAutospacing="0"/>
-        <w:jc w:val="both"/>
+      <w:r>
         <w:rPr>
           <w:rFonts w:eastAsiaTheme="minorHAnsi"/>
-          <w:b/>
-          <w:i/>
-          <w:color w:val="000000"/>
-        </w:rPr>
-      </w:pPr>
-      <w:r>
-        <w:rPr>
-          <w:b/>
-        </w:rPr>
-        <w:t xml:space="preserve">Задание 1.3. </w:t>
-      </w:r>
-      <w:r>
-        <w:rPr>
-          <w:rFonts w:eastAsiaTheme="minorHAnsi"/>
-          <w:b/>
-          <w:i/>
-          <w:color w:val="000000"/>
-        </w:rPr>
-        <w:t>Разработка схем использования технологий электронного обучения при организации и осуществлении корпоративного обучения (на конкретном примере по выбору магистранта).</w:t>
-      </w:r>
-    </w:p>
-    <w:p>
-      <w:pPr>
-        <w:pStyle w:val="a5"/>
-        <w:spacing w:before="0" w:beforeAutospacing="0" w:after="0" w:afterAutospacing="0"/>
-        <w:jc w:val="both"/>
-        <w:rPr>
-          <w:rFonts w:ascii="Times" w:eastAsiaTheme="minorHAnsi" w:hAnsi="Times"/>
-          <w:sz w:val="20"/>
-          <w:szCs w:val="20"/>
-        </w:rPr>
-      </w:pPr>
-    </w:p>
-    <w:p>
-      <w:pPr>
-        <w:pStyle w:val="a5"/>
-        <w:spacing w:before="0" w:beforeAutospacing="0" w:after="0" w:afterAutospacing="0"/>
-        <w:jc w:val="both"/>
-        <w:rPr>
-          <w:rFonts w:eastAsiaTheme="minorHAnsi"/>
-          <w:color w:val="000000"/>
-        </w:rPr>
-      </w:pPr>
-      <w:r>
-        <w:t>Примечание</w:t>
-      </w:r>
-      <w:r>
-        <w:t xml:space="preserve">: </w:t>
-      </w:r>
-      <w:r>
-        <w:rPr>
-          <w:rFonts w:eastAsiaTheme="minorHAnsi"/>
-          <w:color w:val="000000"/>
-        </w:rPr>
-        <w:t>Интеллект-карта</w:t>
-      </w:r>
-    </w:p>
-    <w:p>
-      <w:pPr>
-        <w:pStyle w:val="11"/>
-        <w:ind w:left="-851" w:firstLine="851"/>
-        <w:rPr>
-          <w:rFonts w:ascii="Times New Roman" w:eastAsia="Times New Roman" w:hAnsi="Times New Roman"/>
-          <w:b/>
-          <w:i/>
-          <w:color w:val="000000"/>
-          <w:sz w:val="28"/>
-          <w:szCs w:val="24"/>
-        </w:rPr>
-      </w:pPr>
-      <w:r>
-        <w:rPr>
-          <w:rFonts w:ascii="Times New Roman" w:eastAsia="Times New Roman" w:hAnsi="Times New Roman"/>
-          <w:i/>
-          <w:sz w:val="24"/>
-        </w:rPr>
-        <w:t>QR-код задания (на GIT-репозиторий):</w:t>
-      </w:r>
-    </w:p>
-    <w:p>
-      <w:pPr>
-        <w:pStyle w:val="a5"/>
-        <w:spacing w:before="0" w:beforeAutospacing="0" w:after="0" w:afterAutospacing="0"/>
-        <w:jc w:val="both"/>
-        <w:rPr>
-          <w:rFonts w:ascii="Times" w:eastAsiaTheme="minorHAnsi" w:hAnsi="Times"/>
-          <w:sz w:val="20"/>
-          <w:szCs w:val="20"/>
-        </w:rPr>
-      </w:pPr>
-    </w:p>
-    <w:p>
-      <w:pPr>
-        <w:spacing w:after="0" w:line="240" w:lineRule="auto"/>
-        <w:jc w:val="both"/>
-        <w:rPr>
-          <w:rFonts w:ascii="Times New Roman" w:eastAsia="Times New Roman" w:hAnsi="Times New Roman"/>
-          <w:color w:val="000000"/>
-          <w:sz w:val="24"/>
-          <w:szCs w:val="24"/>
-          <w:lang w:eastAsia="ru-RU"/>
-        </w:rPr>
-      </w:pPr>
+          <w:noProof/>
+          <w:color w:val="000000"/>
+        </w:rPr>
+        <w:lastRenderedPageBreak/>
+        <w:drawing>
+          <wp:inline distT="0" distB="0" distL="0" distR="0" wp14:anchorId="4666BC60" wp14:editId="6E55917A">
+            <wp:extent cx="2880000" cy="2880000"/>
+            <wp:effectExtent l="0" t="0" r="0" b="0"/>
+            <wp:docPr id="2043990087" name="Рисунок 2"/>
+            <wp:cNvGraphicFramePr>
+              <a:graphicFrameLocks xmlns:a="http://schemas.openxmlformats.org/drawingml/2006/main" noChangeAspect="1"/>
+            </wp:cNvGraphicFramePr>
+            <a:graphic xmlns:a="http://schemas.openxmlformats.org/drawingml/2006/main">
+              <a:graphicData uri="http://schemas.openxmlformats.org/drawingml/2006/picture">
+                <pic:pic xmlns:pic="http://schemas.openxmlformats.org/drawingml/2006/picture">
+                  <pic:nvPicPr>
+                    <pic:cNvPr id="1455799580" name="Рисунок 1455799580"/>
+                    <pic:cNvPicPr/>
+                  </pic:nvPicPr>
+                  <pic:blipFill>
+                    <a:blip r:embed="rId7"/>
+                    <a:stretch>
+                      <a:fillRect/>
+                    </a:stretch>
+                  </pic:blipFill>
+                  <pic:spPr>
+                    <a:xfrm>
+                      <a:off x="0" y="0"/>
+                      <a:ext cx="2880000" cy="2880000"/>
+                    </a:xfrm>
+                    <a:prstGeom prst="rect">
+                      <a:avLst/>
+                    </a:prstGeom>
+                  </pic:spPr>
+                </pic:pic>
+              </a:graphicData>
+            </a:graphic>
+          </wp:inline>
+        </w:drawing>
+      </w:r>
     </w:p>
     <w:p>
       <w:pPr>
@@ -1713,6 +1829,48 @@
           <w:color w:val="000000"/>
         </w:rPr>
       </w:pPr>
+      <w:r>
+        <w:rPr>
+          <w:rFonts w:eastAsiaTheme="minorHAnsi"/>
+          <w:noProof/>
+          <w:color w:val="000000"/>
+        </w:rPr>
+        <w:drawing>
+          <wp:inline distT="0" distB="0" distL="0" distR="0" wp14:anchorId="70BF3C84" wp14:editId="73817D39">
+            <wp:extent cx="2880000" cy="2880000"/>
+            <wp:effectExtent l="0" t="0" r="0" b="0"/>
+            <wp:docPr id="366262876" name="Рисунок 2"/>
+            <wp:cNvGraphicFramePr>
+              <a:graphicFrameLocks xmlns:a="http://schemas.openxmlformats.org/drawingml/2006/main" noChangeAspect="1"/>
+            </wp:cNvGraphicFramePr>
+            <a:graphic xmlns:a="http://schemas.openxmlformats.org/drawingml/2006/main">
+              <a:graphicData uri="http://schemas.openxmlformats.org/drawingml/2006/picture">
+                <pic:pic xmlns:pic="http://schemas.openxmlformats.org/drawingml/2006/picture">
+                  <pic:nvPicPr>
+                    <pic:cNvPr id="1455799580" name="Рисунок 1455799580"/>
+                    <pic:cNvPicPr/>
+                  </pic:nvPicPr>
+                  <pic:blipFill>
+                    <a:blip r:embed="rId7"/>
+                    <a:stretch>
+                      <a:fillRect/>
+                    </a:stretch>
+                  </pic:blipFill>
+                  <pic:spPr>
+                    <a:xfrm>
+                      <a:off x="0" y="0"/>
+                      <a:ext cx="2880000" cy="2880000"/>
+                    </a:xfrm>
+                    <a:prstGeom prst="rect">
+                      <a:avLst/>
+                    </a:prstGeom>
+                  </pic:spPr>
+                </pic:pic>
+              </a:graphicData>
+            </a:graphic>
+          </wp:inline>
+        </w:drawing>
+      </w:r>
     </w:p>
     <w:p>
       <w:pPr>
@@ -1821,18 +1979,6 @@
     </w:p>
     <w:p>
       <w:pPr>
-        <w:pStyle w:val="a5"/>
-        <w:spacing w:before="0" w:beforeAutospacing="0" w:after="0" w:afterAutospacing="0"/>
-        <w:jc w:val="both"/>
-        <w:rPr>
-          <w:rFonts w:ascii="Times" w:eastAsiaTheme="minorHAnsi" w:hAnsi="Times"/>
-          <w:sz w:val="20"/>
-          <w:szCs w:val="20"/>
-        </w:rPr>
-      </w:pPr>
-    </w:p>
-    <w:p>
-      <w:pPr>
         <w:spacing w:after="0" w:line="240" w:lineRule="auto"/>
         <w:jc w:val="both"/>
         <w:rPr>
@@ -1842,6 +1988,184 @@
           <w:lang w:eastAsia="ru-RU"/>
         </w:rPr>
       </w:pPr>
+      <w:r>
+        <w:rPr>
+          <w:rFonts w:eastAsiaTheme="minorHAnsi"/>
+          <w:noProof/>
+          <w:color w:val="000000"/>
+        </w:rPr>
+        <w:lastRenderedPageBreak/>
+        <w:drawing>
+          <wp:inline distT="0" distB="0" distL="0" distR="0" wp14:anchorId="731558D7" wp14:editId="14FE1BC8">
+            <wp:extent cx="2880000" cy="2880000"/>
+            <wp:effectExtent l="0" t="0" r="0" b="0"/>
+            <wp:docPr id="827085114" name="Рисунок 2"/>
+            <wp:cNvGraphicFramePr>
+              <a:graphicFrameLocks xmlns:a="http://schemas.openxmlformats.org/drawingml/2006/main" noChangeAspect="1"/>
+            </wp:cNvGraphicFramePr>
+            <a:graphic xmlns:a="http://schemas.openxmlformats.org/drawingml/2006/main">
+              <a:graphicData uri="http://schemas.openxmlformats.org/drawingml/2006/picture">
+                <pic:pic xmlns:pic="http://schemas.openxmlformats.org/drawingml/2006/picture">
+                  <pic:nvPicPr>
+                    <pic:cNvPr id="1455799580" name="Рисунок 1455799580"/>
+                    <pic:cNvPicPr/>
+                  </pic:nvPicPr>
+                  <pic:blipFill>
+                    <a:blip r:embed="rId7"/>
+                    <a:stretch>
+                      <a:fillRect/>
+                    </a:stretch>
+                  </pic:blipFill>
+                  <pic:spPr>
+                    <a:xfrm>
+                      <a:off x="0" y="0"/>
+                      <a:ext cx="2880000" cy="2880000"/>
+                    </a:xfrm>
+                    <a:prstGeom prst="rect">
+                      <a:avLst/>
+                    </a:prstGeom>
+                  </pic:spPr>
+                </pic:pic>
+              </a:graphicData>
+            </a:graphic>
+          </wp:inline>
+        </w:drawing>
+      </w:r>
+    </w:p>
+    <w:p>
+      <w:pPr>
+        <w:pStyle w:val="a5"/>
+        <w:spacing w:before="0" w:beforeAutospacing="0" w:after="0" w:afterAutospacing="0"/>
+        <w:jc w:val="both"/>
+        <w:rPr>
+          <w:rFonts w:eastAsiaTheme="minorHAnsi"/>
+          <w:b/>
+          <w:i/>
+          <w:color w:val="000000"/>
+        </w:rPr>
+      </w:pPr>
+      <w:r>
+        <w:rPr>
+          <w:b/>
+        </w:rPr>
+        <w:t>Задание 1.6</w:t>
+      </w:r>
+      <w:r>
+        <w:rPr>
+          <w:b/>
+        </w:rPr>
+        <w:t xml:space="preserve">. </w:t>
+      </w:r>
+      <w:r>
+        <w:rPr>
+          <w:rFonts w:eastAsiaTheme="minorHAnsi"/>
+          <w:b/>
+          <w:i/>
+          <w:color w:val="000000"/>
+        </w:rPr>
+        <w:t>Посещение и анализ занятий, проводимых преподавателем (учителем).</w:t>
+      </w:r>
+    </w:p>
+    <w:p>
+      <w:pPr>
+        <w:pStyle w:val="a5"/>
+        <w:spacing w:before="0" w:beforeAutospacing="0" w:after="0" w:afterAutospacing="0"/>
+        <w:jc w:val="both"/>
+        <w:rPr>
+          <w:rFonts w:ascii="Times" w:eastAsiaTheme="minorHAnsi" w:hAnsi="Times"/>
+          <w:sz w:val="20"/>
+          <w:szCs w:val="20"/>
+        </w:rPr>
+      </w:pPr>
+    </w:p>
+    <w:p>
+      <w:pPr>
+        <w:pStyle w:val="a5"/>
+        <w:spacing w:before="0" w:beforeAutospacing="0" w:after="0" w:afterAutospacing="0"/>
+        <w:jc w:val="both"/>
+      </w:pPr>
+      <w:r>
+        <w:t>Примечание</w:t>
+      </w:r>
+      <w:r>
+        <w:t>: Анализ</w:t>
+      </w:r>
+    </w:p>
+    <w:p>
+      <w:pPr>
+        <w:pStyle w:val="11"/>
+        <w:ind w:left="-851" w:firstLine="851"/>
+        <w:rPr>
+          <w:rFonts w:ascii="Times New Roman" w:eastAsia="Times New Roman" w:hAnsi="Times New Roman"/>
+          <w:b/>
+          <w:i/>
+          <w:color w:val="000000"/>
+          <w:sz w:val="28"/>
+          <w:szCs w:val="24"/>
+        </w:rPr>
+      </w:pPr>
+      <w:r>
+        <w:rPr>
+          <w:rFonts w:ascii="Times New Roman" w:eastAsia="Times New Roman" w:hAnsi="Times New Roman"/>
+          <w:i/>
+          <w:sz w:val="24"/>
+        </w:rPr>
+        <w:t>QR-код задания (на GIT-репозиторий):</w:t>
+      </w:r>
+    </w:p>
+    <w:p>
+      <w:pPr>
+        <w:pStyle w:val="a5"/>
+        <w:spacing w:before="0" w:beforeAutospacing="0" w:after="0" w:afterAutospacing="0"/>
+        <w:jc w:val="both"/>
+        <w:rPr>
+          <w:rFonts w:ascii="Times" w:eastAsiaTheme="minorHAnsi" w:hAnsi="Times"/>
+          <w:sz w:val="20"/>
+          <w:szCs w:val="20"/>
+        </w:rPr>
+      </w:pPr>
+      <w:r>
+        <w:rPr>
+          <w:rFonts w:eastAsiaTheme="minorHAnsi"/>
+          <w:noProof/>
+          <w:color w:val="000000"/>
+        </w:rPr>
+        <w:drawing>
+          <wp:inline distT="0" distB="0" distL="0" distR="0" wp14:anchorId="6AB55782" wp14:editId="49EAF3BD">
+            <wp:extent cx="2880000" cy="2880000"/>
+            <wp:effectExtent l="0" t="0" r="0" b="0"/>
+            <wp:docPr id="1369831250" name="Рисунок 2"/>
+            <wp:cNvGraphicFramePr>
+              <a:graphicFrameLocks xmlns:a="http://schemas.openxmlformats.org/drawingml/2006/main" noChangeAspect="1"/>
+            </wp:cNvGraphicFramePr>
+            <a:graphic xmlns:a="http://schemas.openxmlformats.org/drawingml/2006/main">
+              <a:graphicData uri="http://schemas.openxmlformats.org/drawingml/2006/picture">
+                <pic:pic xmlns:pic="http://schemas.openxmlformats.org/drawingml/2006/picture">
+                  <pic:nvPicPr>
+                    <pic:cNvPr id="1455799580" name="Рисунок 1455799580"/>
+                    <pic:cNvPicPr/>
+                  </pic:nvPicPr>
+                  <pic:blipFill>
+                    <a:blip r:embed="rId7"/>
+                    <a:stretch>
+                      <a:fillRect/>
+                    </a:stretch>
+                  </pic:blipFill>
+                  <pic:spPr>
+                    <a:xfrm>
+                      <a:off x="0" y="0"/>
+                      <a:ext cx="2880000" cy="2880000"/>
+                    </a:xfrm>
+                    <a:prstGeom prst="rect">
+                      <a:avLst/>
+                    </a:prstGeom>
+                  </pic:spPr>
+                </pic:pic>
+              </a:graphicData>
+            </a:graphic>
+          </wp:inline>
+        </w:drawing>
+      </w:r>
     </w:p>
     <w:p>
       <w:pPr>
@@ -1870,13 +2194,19 @@
         <w:rPr>
           <w:b/>
         </w:rPr>
-        <w:t>Задание 1.6</w:t>
-      </w:r>
-      <w:r>
-        <w:rPr>
-          <w:b/>
-        </w:rPr>
-        <w:t xml:space="preserve">. </w:t>
+        <w:t>Задание 1.7</w:t>
+      </w:r>
+      <w:r>
+        <w:rPr>
+          <w:b/>
+        </w:rPr>
+        <w:t>.</w:t>
+      </w:r>
+      <w:r>
+        <w:rPr>
+          <w:b/>
+        </w:rPr>
+        <w:t xml:space="preserve"> </w:t>
       </w:r>
       <w:r>
         <w:rPr>
@@ -1885,7 +2215,7 @@
           <w:i/>
           <w:color w:val="000000"/>
         </w:rPr>
-        <w:t>Посещение и анализ занятий, проводимых преподавателем (учителем).</w:t>
+        <w:t>Проведение самоанализа профессиональной деятельности при прохождении практики</w:t>
       </w:r>
     </w:p>
     <w:p>
@@ -1910,7 +2240,7 @@
         <w:t>Примечание</w:t>
       </w:r>
       <w:r>
-        <w:t>: Анализ</w:t>
+        <w:t>: Самоанализ</w:t>
       </w:r>
     </w:p>
     <w:p>
@@ -1940,6 +2270,137 @@
         <w:pStyle w:val="a5"/>
         <w:spacing w:before="0" w:beforeAutospacing="0" w:after="0" w:afterAutospacing="0"/>
         <w:jc w:val="both"/>
+        <w:rPr>
+          <w:rFonts w:ascii="Times" w:eastAsiaTheme="minorHAnsi" w:hAnsi="Times"/>
+          <w:sz w:val="20"/>
+          <w:szCs w:val="20"/>
+        </w:rPr>
+      </w:pPr>
+      <w:r>
+        <w:rPr>
+          <w:rFonts w:eastAsiaTheme="minorHAnsi"/>
+          <w:noProof/>
+          <w:color w:val="000000"/>
+        </w:rPr>
+        <w:lastRenderedPageBreak/>
+        <w:drawing>
+          <wp:inline distT="0" distB="0" distL="0" distR="0" wp14:anchorId="73D6E26D" wp14:editId="15B97546">
+            <wp:extent cx="2880000" cy="2880000"/>
+            <wp:effectExtent l="0" t="0" r="0" b="0"/>
+            <wp:docPr id="497691879" name="Рисунок 2"/>
+            <wp:cNvGraphicFramePr>
+              <a:graphicFrameLocks xmlns:a="http://schemas.openxmlformats.org/drawingml/2006/main" noChangeAspect="1"/>
+            </wp:cNvGraphicFramePr>
+            <a:graphic xmlns:a="http://schemas.openxmlformats.org/drawingml/2006/main">
+              <a:graphicData uri="http://schemas.openxmlformats.org/drawingml/2006/picture">
+                <pic:pic xmlns:pic="http://schemas.openxmlformats.org/drawingml/2006/picture">
+                  <pic:nvPicPr>
+                    <pic:cNvPr id="1455799580" name="Рисунок 1455799580"/>
+                    <pic:cNvPicPr/>
+                  </pic:nvPicPr>
+                  <pic:blipFill>
+                    <a:blip r:embed="rId7"/>
+                    <a:stretch>
+                      <a:fillRect/>
+                    </a:stretch>
+                  </pic:blipFill>
+                  <pic:spPr>
+                    <a:xfrm>
+                      <a:off x="0" y="0"/>
+                      <a:ext cx="2880000" cy="2880000"/>
+                    </a:xfrm>
+                    <a:prstGeom prst="rect">
+                      <a:avLst/>
+                    </a:prstGeom>
+                  </pic:spPr>
+                </pic:pic>
+              </a:graphicData>
+            </a:graphic>
+          </wp:inline>
+        </w:drawing>
+      </w:r>
+    </w:p>
+    <w:p>
+      <w:pPr>
+        <w:pStyle w:val="1"/>
+        <w:jc w:val="center"/>
+        <w:rPr>
+          <w:lang w:eastAsia="ru-RU"/>
+        </w:rPr>
+      </w:pPr>
+      <w:r>
+        <w:rPr>
+          <w:lang w:val="en-US" w:eastAsia="ru-RU"/>
+        </w:rPr>
+        <w:t>II</w:t>
+      </w:r>
+      <w:r>
+        <w:rPr>
+          <w:lang w:eastAsia="ru-RU"/>
+        </w:rPr>
+        <w:t xml:space="preserve">. </w:t>
+      </w:r>
+      <w:r>
+        <w:rPr>
+          <w:lang w:eastAsia="ru-RU"/>
+        </w:rPr>
+        <w:t>Вариативная самостоятельная работа</w:t>
+      </w:r>
+    </w:p>
+    <w:p>
+      <w:pPr>
+        <w:spacing w:after="0" w:line="240" w:lineRule="auto"/>
+        <w:jc w:val="center"/>
+        <w:rPr>
+          <w:rFonts w:ascii="Times New Roman" w:eastAsia="Times New Roman" w:hAnsi="Times New Roman"/>
+          <w:b/>
+          <w:bCs/>
+          <w:color w:val="000000"/>
+          <w:sz w:val="24"/>
+          <w:szCs w:val="24"/>
+          <w:lang w:eastAsia="ru-RU"/>
+        </w:rPr>
+      </w:pPr>
+      <w:r>
+        <w:rPr>
+          <w:rFonts w:ascii="Times New Roman" w:eastAsia="Times New Roman" w:hAnsi="Times New Roman"/>
+          <w:b/>
+          <w:bCs/>
+          <w:color w:val="000000"/>
+          <w:sz w:val="24"/>
+          <w:szCs w:val="24"/>
+          <w:lang w:eastAsia="ru-RU"/>
+        </w:rPr>
+        <w:t>(выбрать одно из заданий с одинаковыми номерами)</w:t>
+      </w:r>
+    </w:p>
+    <w:p>
+      <w:pPr>
+        <w:spacing w:after="0" w:line="240" w:lineRule="auto"/>
+        <w:jc w:val="center"/>
+        <w:rPr>
+          <w:rFonts w:ascii="Times New Roman" w:eastAsia="Times New Roman" w:hAnsi="Times New Roman"/>
+          <w:b/>
+          <w:bCs/>
+          <w:color w:val="000000"/>
+          <w:sz w:val="24"/>
+          <w:szCs w:val="24"/>
+          <w:lang w:eastAsia="ru-RU"/>
+        </w:rPr>
+      </w:pPr>
+    </w:p>
+    <w:p>
+      <w:pPr>
+        <w:spacing w:after="0" w:line="240" w:lineRule="auto"/>
+        <w:rPr>
+          <w:rFonts w:ascii="Times New Roman" w:eastAsia="Times New Roman" w:hAnsi="Times New Roman"/>
+          <w:b/>
+          <w:bCs/>
+          <w:color w:val="000000"/>
+          <w:sz w:val="24"/>
+          <w:szCs w:val="24"/>
+          <w:lang w:eastAsia="ru-RU"/>
+        </w:rPr>
       </w:pPr>
     </w:p>
     <w:p>
@@ -1948,11 +2409,117 @@
         <w:spacing w:before="0" w:beforeAutospacing="0" w:after="0" w:afterAutospacing="0"/>
         <w:jc w:val="both"/>
         <w:rPr>
-          <w:rFonts w:ascii="Times" w:eastAsiaTheme="minorHAnsi" w:hAnsi="Times"/>
-          <w:sz w:val="20"/>
-          <w:szCs w:val="20"/>
-        </w:rPr>
-      </w:pPr>
+          <w:rFonts w:eastAsiaTheme="minorHAnsi"/>
+          <w:b/>
+          <w:i/>
+          <w:color w:val="000000"/>
+        </w:rPr>
+      </w:pPr>
+      <w:r>
+        <w:rPr>
+          <w:rFonts w:eastAsiaTheme="minorHAnsi"/>
+          <w:b/>
+          <w:color w:val="000000"/>
+        </w:rPr>
+        <w:t xml:space="preserve">Задание 2.1. </w:t>
+      </w:r>
+      <w:r>
+        <w:rPr>
+          <w:rFonts w:eastAsiaTheme="minorHAnsi"/>
+          <w:b/>
+          <w:i/>
+          <w:color w:val="000000"/>
+        </w:rPr>
+        <w:t xml:space="preserve">Знакомство с нормативно-правовыми документами по использованию электронного обучения (ЭО) в образовании </w:t>
+      </w:r>
+    </w:p>
+    <w:p>
+      <w:pPr>
+        <w:pStyle w:val="a5"/>
+        <w:spacing w:before="0" w:beforeAutospacing="0" w:after="0" w:afterAutospacing="0"/>
+        <w:jc w:val="both"/>
+      </w:pPr>
+    </w:p>
+    <w:p>
+      <w:pPr>
+        <w:pStyle w:val="a5"/>
+        <w:spacing w:before="0" w:beforeAutospacing="0" w:after="0" w:afterAutospacing="0"/>
+        <w:jc w:val="both"/>
+        <w:rPr>
+          <w:rFonts w:eastAsiaTheme="minorHAnsi"/>
+          <w:color w:val="000000"/>
+        </w:rPr>
+      </w:pPr>
+      <w:r>
+        <w:t>Создание рекомендаций (электронный формат) "ЭО: стандарты и нормативно-правовая база"</w:t>
+      </w:r>
+    </w:p>
+    <w:p>
+      <w:pPr>
+        <w:spacing w:after="0" w:line="240" w:lineRule="auto"/>
+        <w:ind w:left="720"/>
+        <w:jc w:val="both"/>
+        <w:textAlignment w:val="baseline"/>
+        <w:rPr>
+          <w:rFonts w:ascii="Noto Sans Symbols" w:eastAsiaTheme="minorHAnsi" w:hAnsi="Noto Sans Symbols"/>
+          <w:color w:val="000000"/>
+          <w:lang w:eastAsia="ru-RU"/>
+        </w:rPr>
+      </w:pPr>
+    </w:p>
+    <w:p>
+      <w:pPr>
+        <w:spacing w:after="0" w:line="240" w:lineRule="auto"/>
+        <w:rPr>
+          <w:rFonts w:ascii="Times New Roman" w:eastAsia="Times New Roman" w:hAnsi="Times New Roman"/>
+          <w:color w:val="000000"/>
+          <w:sz w:val="24"/>
+          <w:szCs w:val="24"/>
+          <w:lang w:eastAsia="ru-RU"/>
+        </w:rPr>
+      </w:pPr>
+      <w:r>
+        <w:rPr>
+          <w:rFonts w:ascii="Times New Roman" w:eastAsia="Times New Roman" w:hAnsi="Times New Roman"/>
+          <w:color w:val="000000"/>
+          <w:sz w:val="24"/>
+          <w:szCs w:val="24"/>
+          <w:lang w:eastAsia="ru-RU"/>
+        </w:rPr>
+        <w:t xml:space="preserve">Примечание: </w:t>
+      </w:r>
+      <w:r>
+        <w:rPr>
+          <w:rFonts w:ascii="Times New Roman" w:eastAsia="Times New Roman" w:hAnsi="Times New Roman"/>
+          <w:color w:val="000000"/>
+          <w:sz w:val="24"/>
+          <w:szCs w:val="24"/>
+          <w:lang w:eastAsia="ru-RU"/>
+        </w:rPr>
+        <w:t>Рекомендации</w:t>
+      </w:r>
+    </w:p>
+    <w:p>
+      <w:pPr>
+        <w:pStyle w:val="11"/>
+        <w:ind w:left="-851" w:firstLine="851"/>
+        <w:rPr>
+          <w:rFonts w:ascii="Times New Roman" w:eastAsia="Times New Roman" w:hAnsi="Times New Roman"/>
+          <w:b/>
+          <w:i/>
+          <w:color w:val="000000"/>
+          <w:sz w:val="28"/>
+          <w:szCs w:val="24"/>
+        </w:rPr>
+      </w:pPr>
+      <w:r>
+        <w:rPr>
+          <w:rFonts w:ascii="Times New Roman" w:eastAsia="Times New Roman" w:hAnsi="Times New Roman"/>
+          <w:i/>
+          <w:sz w:val="24"/>
+        </w:rPr>
+        <w:t>QR-код задания (на GIT-репозиторий):</w:t>
+      </w:r>
     </w:p>
     <w:p>
       <w:pPr>
@@ -1964,370 +2531,48 @@
           <w:lang w:eastAsia="ru-RU"/>
         </w:rPr>
       </w:pPr>
-    </w:p>
-    <w:p>
-      <w:pPr>
-        <w:pStyle w:val="a5"/>
-        <w:spacing w:before="0" w:beforeAutospacing="0" w:after="0" w:afterAutospacing="0"/>
-        <w:jc w:val="both"/>
+      <w:r>
         <w:rPr>
           <w:rFonts w:eastAsiaTheme="minorHAnsi"/>
-          <w:b/>
-          <w:i/>
-          <w:color w:val="000000"/>
-        </w:rPr>
-      </w:pPr>
-      <w:r>
-        <w:rPr>
-          <w:b/>
-        </w:rPr>
-        <w:t>Задание 1.7</w:t>
-      </w:r>
-      <w:r>
-        <w:rPr>
-          <w:b/>
-        </w:rPr>
-        <w:t>.</w:t>
-      </w:r>
-      <w:r>
-        <w:rPr>
-          <w:b/>
-        </w:rPr>
-        <w:t xml:space="preserve"> </w:t>
-      </w:r>
-      <w:r>
-        <w:rPr>
-          <w:rFonts w:eastAsiaTheme="minorHAnsi"/>
-          <w:b/>
-          <w:i/>
-          <w:color w:val="000000"/>
-        </w:rPr>
-        <w:t xml:space="preserve">Проведение самоанализа </w:t>
-      </w:r>
-      <w:proofErr w:type="spellStart"/>
-      <w:r>
-        <w:rPr>
-          <w:rFonts w:eastAsiaTheme="minorHAnsi"/>
-          <w:b/>
-          <w:i/>
-          <w:color w:val="000000"/>
-        </w:rPr>
-        <w:t>профессиональнои</w:t>
-      </w:r>
-      <w:proofErr w:type="spellEnd"/>
-      <w:r>
-        <w:rPr>
-          <w:rFonts w:eastAsiaTheme="minorHAnsi"/>
-          <w:b/>
-          <w:i/>
-          <w:color w:val="000000"/>
-        </w:rPr>
-        <w:t>̆ деятельности при прохождении практики</w:t>
-      </w:r>
-    </w:p>
-    <w:p>
-      <w:pPr>
-        <w:pStyle w:val="a5"/>
-        <w:spacing w:before="0" w:beforeAutospacing="0" w:after="0" w:afterAutospacing="0"/>
-        <w:jc w:val="both"/>
-        <w:rPr>
-          <w:rFonts w:ascii="Times" w:eastAsiaTheme="minorHAnsi" w:hAnsi="Times"/>
-          <w:sz w:val="20"/>
-          <w:szCs w:val="20"/>
-        </w:rPr>
-      </w:pPr>
-    </w:p>
-    <w:p>
-      <w:pPr>
-        <w:pStyle w:val="a5"/>
-        <w:spacing w:before="0" w:beforeAutospacing="0" w:after="0" w:afterAutospacing="0"/>
-        <w:jc w:val="both"/>
-      </w:pPr>
-      <w:r>
-        <w:t>Примечание</w:t>
-      </w:r>
-      <w:r>
-        <w:t>: Самоанализ</w:t>
-      </w:r>
-    </w:p>
-    <w:p>
-      <w:pPr>
-        <w:pStyle w:val="11"/>
-        <w:ind w:left="-851" w:firstLine="851"/>
-        <w:rPr>
-          <w:rFonts w:ascii="Times New Roman" w:eastAsia="Times New Roman" w:hAnsi="Times New Roman"/>
-          <w:b/>
-          <w:i/>
-          <w:color w:val="000000"/>
-          <w:sz w:val="28"/>
-          <w:szCs w:val="24"/>
-        </w:rPr>
-      </w:pPr>
-      <w:r>
-        <w:rPr>
-          <w:rFonts w:ascii="Times New Roman" w:eastAsia="Times New Roman" w:hAnsi="Times New Roman"/>
-          <w:i/>
-          <w:sz w:val="24"/>
-        </w:rPr>
-        <w:t>QR-код задания (на GIT-репозиторий):</w:t>
-      </w:r>
-    </w:p>
-    <w:p>
-      <w:pPr>
-        <w:pStyle w:val="a5"/>
-        <w:spacing w:before="0" w:beforeAutospacing="0" w:after="0" w:afterAutospacing="0"/>
-        <w:jc w:val="both"/>
-        <w:rPr>
-          <w:rFonts w:ascii="Times" w:eastAsiaTheme="minorHAnsi" w:hAnsi="Times"/>
-          <w:sz w:val="20"/>
-          <w:szCs w:val="20"/>
-        </w:rPr>
-      </w:pPr>
-    </w:p>
-    <w:p>
-      <w:pPr>
-        <w:spacing w:after="0" w:line="240" w:lineRule="auto"/>
-        <w:rPr>
-          <w:rFonts w:ascii="Times" w:eastAsia="Times New Roman" w:hAnsi="Times"/>
-          <w:sz w:val="20"/>
-          <w:szCs w:val="20"/>
-          <w:lang w:eastAsia="ru-RU"/>
-        </w:rPr>
-      </w:pPr>
-    </w:p>
-    <w:p>
-      <w:pPr>
-        <w:spacing w:after="0" w:line="240" w:lineRule="auto"/>
-        <w:rPr>
-          <w:rFonts w:ascii="Times" w:eastAsia="Times New Roman" w:hAnsi="Times"/>
-          <w:sz w:val="20"/>
-          <w:szCs w:val="20"/>
-          <w:lang w:eastAsia="ru-RU"/>
-        </w:rPr>
-      </w:pPr>
-    </w:p>
-    <w:p>
-      <w:pPr>
-        <w:spacing w:after="0" w:line="240" w:lineRule="auto"/>
-        <w:rPr>
-          <w:rFonts w:ascii="Times" w:eastAsia="Times New Roman" w:hAnsi="Times"/>
-          <w:sz w:val="20"/>
-          <w:szCs w:val="20"/>
-          <w:lang w:eastAsia="ru-RU"/>
-        </w:rPr>
-      </w:pPr>
-    </w:p>
-    <w:p>
-      <w:pPr>
-        <w:pStyle w:val="1"/>
-        <w:jc w:val="center"/>
-        <w:rPr>
-          <w:lang w:eastAsia="ru-RU"/>
-        </w:rPr>
-      </w:pPr>
-      <w:r>
-        <w:rPr>
-          <w:lang w:val="en-US" w:eastAsia="ru-RU"/>
-        </w:rPr>
-        <w:t>II</w:t>
-      </w:r>
-      <w:r>
-        <w:rPr>
-          <w:lang w:eastAsia="ru-RU"/>
-        </w:rPr>
-        <w:t xml:space="preserve">. </w:t>
-      </w:r>
-      <w:r>
-        <w:rPr>
-          <w:lang w:eastAsia="ru-RU"/>
-        </w:rPr>
-        <w:t>Вариативная самостоятельная работа</w:t>
-      </w:r>
-    </w:p>
-    <w:p>
-      <w:pPr>
-        <w:spacing w:after="0" w:line="240" w:lineRule="auto"/>
-        <w:jc w:val="center"/>
-        <w:rPr>
-          <w:rFonts w:ascii="Times New Roman" w:eastAsia="Times New Roman" w:hAnsi="Times New Roman"/>
-          <w:b/>
-          <w:bCs/>
-          <w:color w:val="000000"/>
-          <w:sz w:val="24"/>
-          <w:szCs w:val="24"/>
-          <w:lang w:eastAsia="ru-RU"/>
-        </w:rPr>
-      </w:pPr>
-      <w:r>
-        <w:rPr>
-          <w:rFonts w:ascii="Times New Roman" w:eastAsia="Times New Roman" w:hAnsi="Times New Roman"/>
-          <w:b/>
-          <w:bCs/>
-          <w:color w:val="000000"/>
-          <w:sz w:val="24"/>
-          <w:szCs w:val="24"/>
-          <w:lang w:eastAsia="ru-RU"/>
-        </w:rPr>
-        <w:t>(выбрать одно из заданий с одинаковыми номерами)</w:t>
-      </w:r>
-    </w:p>
-    <w:p>
-      <w:pPr>
-        <w:spacing w:after="0" w:line="240" w:lineRule="auto"/>
-        <w:jc w:val="center"/>
-        <w:rPr>
-          <w:rFonts w:ascii="Times New Roman" w:eastAsia="Times New Roman" w:hAnsi="Times New Roman"/>
-          <w:b/>
-          <w:bCs/>
-          <w:color w:val="000000"/>
-          <w:sz w:val="24"/>
-          <w:szCs w:val="24"/>
-          <w:lang w:eastAsia="ru-RU"/>
-        </w:rPr>
-      </w:pPr>
-    </w:p>
-    <w:p>
-      <w:pPr>
-        <w:spacing w:after="0" w:line="240" w:lineRule="auto"/>
-        <w:rPr>
-          <w:rFonts w:ascii="Times New Roman" w:eastAsia="Times New Roman" w:hAnsi="Times New Roman"/>
-          <w:b/>
-          <w:bCs/>
-          <w:color w:val="000000"/>
-          <w:sz w:val="24"/>
-          <w:szCs w:val="24"/>
-          <w:lang w:eastAsia="ru-RU"/>
-        </w:rPr>
-      </w:pPr>
-    </w:p>
-    <w:p>
-      <w:pPr>
-        <w:pStyle w:val="a5"/>
-        <w:spacing w:before="0" w:beforeAutospacing="0" w:after="0" w:afterAutospacing="0"/>
-        <w:jc w:val="both"/>
-        <w:rPr>
-          <w:rFonts w:eastAsiaTheme="minorHAnsi"/>
-          <w:b/>
-          <w:i/>
-          <w:color w:val="000000"/>
-        </w:rPr>
-      </w:pPr>
-      <w:r>
-        <w:rPr>
-          <w:rFonts w:eastAsiaTheme="minorHAnsi"/>
-          <w:b/>
-          <w:color w:val="000000"/>
-        </w:rPr>
-        <w:t xml:space="preserve">Задание 2.1. </w:t>
-      </w:r>
-      <w:r>
-        <w:rPr>
-          <w:rFonts w:eastAsiaTheme="minorHAnsi"/>
-          <w:b/>
-          <w:i/>
-          <w:color w:val="000000"/>
-        </w:rPr>
-        <w:t xml:space="preserve">Знакомство с нормативно-правовыми документами по использованию электронного обучения (ЭО) в образовании </w:t>
-      </w:r>
-    </w:p>
-    <w:p>
-      <w:pPr>
-        <w:pStyle w:val="a5"/>
-        <w:spacing w:before="0" w:beforeAutospacing="0" w:after="0" w:afterAutospacing="0"/>
-        <w:jc w:val="both"/>
-      </w:pPr>
-    </w:p>
-    <w:p>
-      <w:pPr>
-        <w:pStyle w:val="a5"/>
-        <w:spacing w:before="0" w:beforeAutospacing="0" w:after="0" w:afterAutospacing="0"/>
-        <w:jc w:val="both"/>
-        <w:rPr>
-          <w:rFonts w:eastAsiaTheme="minorHAnsi"/>
-          <w:color w:val="000000"/>
-        </w:rPr>
-      </w:pPr>
-      <w:r>
-        <w:t>Создание рекомендаций (электронный формат) "ЭО: стандарты и нормативно-правовая база"</w:t>
-      </w:r>
-    </w:p>
-    <w:p>
-      <w:pPr>
-        <w:spacing w:after="0" w:line="240" w:lineRule="auto"/>
-        <w:ind w:left="720"/>
-        <w:jc w:val="both"/>
-        <w:textAlignment w:val="baseline"/>
-        <w:rPr>
-          <w:rFonts w:ascii="Noto Sans Symbols" w:eastAsiaTheme="minorHAnsi" w:hAnsi="Noto Sans Symbols"/>
-          <w:color w:val="000000"/>
-          <w:lang w:eastAsia="ru-RU"/>
-        </w:rPr>
-      </w:pPr>
-    </w:p>
-    <w:p>
-      <w:pPr>
-        <w:spacing w:after="0" w:line="240" w:lineRule="auto"/>
-        <w:rPr>
-          <w:rFonts w:ascii="Times New Roman" w:eastAsia="Times New Roman" w:hAnsi="Times New Roman"/>
-          <w:color w:val="000000"/>
-          <w:sz w:val="24"/>
-          <w:szCs w:val="24"/>
-          <w:lang w:eastAsia="ru-RU"/>
-        </w:rPr>
-      </w:pPr>
-      <w:r>
-        <w:rPr>
-          <w:rFonts w:ascii="Times New Roman" w:eastAsia="Times New Roman" w:hAnsi="Times New Roman"/>
-          <w:color w:val="000000"/>
-          <w:sz w:val="24"/>
-          <w:szCs w:val="24"/>
-          <w:lang w:eastAsia="ru-RU"/>
-        </w:rPr>
-        <w:t xml:space="preserve">Примечание: </w:t>
-      </w:r>
-      <w:r>
-        <w:rPr>
-          <w:rFonts w:ascii="Times New Roman" w:eastAsia="Times New Roman" w:hAnsi="Times New Roman"/>
-          <w:color w:val="000000"/>
-          <w:sz w:val="24"/>
-          <w:szCs w:val="24"/>
-          <w:lang w:eastAsia="ru-RU"/>
-        </w:rPr>
-        <w:t>Рекомендации</w:t>
-      </w:r>
-    </w:p>
-    <w:p>
-      <w:pPr>
-        <w:pStyle w:val="11"/>
-        <w:ind w:left="-851" w:firstLine="851"/>
-        <w:rPr>
-          <w:rFonts w:ascii="Times New Roman" w:eastAsia="Times New Roman" w:hAnsi="Times New Roman"/>
-          <w:b/>
-          <w:i/>
-          <w:color w:val="000000"/>
-          <w:sz w:val="28"/>
-          <w:szCs w:val="24"/>
-        </w:rPr>
-      </w:pPr>
-      <w:r>
-        <w:rPr>
-          <w:rFonts w:ascii="Times New Roman" w:eastAsia="Times New Roman" w:hAnsi="Times New Roman"/>
-          <w:i/>
-          <w:sz w:val="24"/>
-        </w:rPr>
-        <w:t>QR-код задания (на GIT-репозиторий):</w:t>
-      </w:r>
-    </w:p>
-    <w:p>
-      <w:pPr>
-        <w:spacing w:after="0" w:line="240" w:lineRule="auto"/>
-        <w:rPr>
-          <w:rFonts w:ascii="Times" w:eastAsia="Times New Roman" w:hAnsi="Times"/>
-          <w:sz w:val="20"/>
-          <w:szCs w:val="20"/>
-          <w:lang w:eastAsia="ru-RU"/>
-        </w:rPr>
-      </w:pPr>
+          <w:noProof/>
+          <w:color w:val="000000"/>
+        </w:rPr>
+        <w:drawing>
+          <wp:inline distT="0" distB="0" distL="0" distR="0" wp14:anchorId="2E49D0E1" wp14:editId="60DF13A4">
+            <wp:extent cx="2880000" cy="2880000"/>
+            <wp:effectExtent l="0" t="0" r="0" b="0"/>
+            <wp:docPr id="25836931" name="Рисунок 2"/>
+            <wp:cNvGraphicFramePr>
+              <a:graphicFrameLocks xmlns:a="http://schemas.openxmlformats.org/drawingml/2006/main" noChangeAspect="1"/>
+            </wp:cNvGraphicFramePr>
+            <a:graphic xmlns:a="http://schemas.openxmlformats.org/drawingml/2006/main">
+              <a:graphicData uri="http://schemas.openxmlformats.org/drawingml/2006/picture">
+                <pic:pic xmlns:pic="http://schemas.openxmlformats.org/drawingml/2006/picture">
+                  <pic:nvPicPr>
+                    <pic:cNvPr id="1455799580" name="Рисунок 1455799580"/>
+                    <pic:cNvPicPr/>
+                  </pic:nvPicPr>
+                  <pic:blipFill>
+                    <a:blip r:embed="rId7"/>
+                    <a:stretch>
+                      <a:fillRect/>
+                    </a:stretch>
+                  </pic:blipFill>
+                  <pic:spPr>
+                    <a:xfrm>
+                      <a:off x="0" y="0"/>
+                      <a:ext cx="2880000" cy="2880000"/>
+                    </a:xfrm>
+                    <a:prstGeom prst="rect">
+                      <a:avLst/>
+                    </a:prstGeom>
+                  </pic:spPr>
+                </pic:pic>
+              </a:graphicData>
+            </a:graphic>
+          </wp:inline>
+        </w:drawing>
+      </w:r>
     </w:p>
     <w:p>
       <w:pPr>
@@ -2416,6 +2661,7 @@
           <w:i/>
           <w:color w:val="000000"/>
         </w:rPr>
+        <w:lastRenderedPageBreak/>
         <w:t>Формат проведения занятия магистрант выбирает самостоятельно.</w:t>
       </w:r>
     </w:p>
@@ -2499,13 +2745,91 @@
           <w:lang w:eastAsia="ru-RU"/>
         </w:rPr>
       </w:pPr>
+      <w:r>
+        <w:rPr>
+          <w:rFonts w:eastAsiaTheme="minorHAnsi"/>
+          <w:noProof/>
+          <w:color w:val="000000"/>
+        </w:rPr>
+        <w:drawing>
+          <wp:inline distT="0" distB="0" distL="0" distR="0" wp14:anchorId="10E3BED8" wp14:editId="0C1D20B7">
+            <wp:extent cx="2880000" cy="2880000"/>
+            <wp:effectExtent l="0" t="0" r="0" b="0"/>
+            <wp:docPr id="927385986" name="Рисунок 2"/>
+            <wp:cNvGraphicFramePr>
+              <a:graphicFrameLocks xmlns:a="http://schemas.openxmlformats.org/drawingml/2006/main" noChangeAspect="1"/>
+            </wp:cNvGraphicFramePr>
+            <a:graphic xmlns:a="http://schemas.openxmlformats.org/drawingml/2006/main">
+              <a:graphicData uri="http://schemas.openxmlformats.org/drawingml/2006/picture">
+                <pic:pic xmlns:pic="http://schemas.openxmlformats.org/drawingml/2006/picture">
+                  <pic:nvPicPr>
+                    <pic:cNvPr id="1455799580" name="Рисунок 1455799580"/>
+                    <pic:cNvPicPr/>
+                  </pic:nvPicPr>
+                  <pic:blipFill>
+                    <a:blip r:embed="rId7"/>
+                    <a:stretch>
+                      <a:fillRect/>
+                    </a:stretch>
+                  </pic:blipFill>
+                  <pic:spPr>
+                    <a:xfrm>
+                      <a:off x="0" y="0"/>
+                      <a:ext cx="2880000" cy="2880000"/>
+                    </a:xfrm>
+                    <a:prstGeom prst="rect">
+                      <a:avLst/>
+                    </a:prstGeom>
+                  </pic:spPr>
+                </pic:pic>
+              </a:graphicData>
+            </a:graphic>
+          </wp:inline>
+        </w:drawing>
+      </w:r>
+    </w:p>
+    <w:p>
+      <w:pPr>
+        <w:pStyle w:val="a5"/>
+        <w:spacing w:before="0" w:beforeAutospacing="0" w:after="0" w:afterAutospacing="0"/>
+        <w:rPr>
+          <w:rFonts w:eastAsiaTheme="minorHAnsi"/>
+          <w:b/>
+          <w:i/>
+          <w:color w:val="000000"/>
+        </w:rPr>
+      </w:pPr>
+      <w:r>
+        <w:rPr>
+          <w:b/>
+          <w:color w:val="000000"/>
+        </w:rPr>
+        <w:t>Задание 2.3</w:t>
+      </w:r>
+      <w:r>
+        <w:rPr>
+          <w:b/>
+          <w:color w:val="000000"/>
+        </w:rPr>
+        <w:t xml:space="preserve">. </w:t>
+      </w:r>
+      <w:r>
+        <w:rPr>
+          <w:rFonts w:eastAsiaTheme="minorHAnsi"/>
+          <w:b/>
+          <w:i/>
+          <w:color w:val="000000"/>
+        </w:rPr>
+        <w:t>Определение технологий профессионального самообразования.</w:t>
+      </w:r>
     </w:p>
     <w:p>
       <w:pPr>
         <w:spacing w:after="0" w:line="240" w:lineRule="auto"/>
-        <w:jc w:val="both"/>
-        <w:rPr>
-          <w:rFonts w:ascii="Times New Roman" w:eastAsiaTheme="minorHAnsi" w:hAnsi="Times New Roman"/>
+        <w:rPr>
+          <w:rFonts w:ascii="Times New Roman" w:eastAsia="Times New Roman" w:hAnsi="Times New Roman"/>
+          <w:b/>
+          <w:i/>
           <w:color w:val="000000"/>
           <w:sz w:val="24"/>
           <w:szCs w:val="24"/>
@@ -2517,79 +2841,24 @@
       <w:pPr>
         <w:spacing w:after="0" w:line="240" w:lineRule="auto"/>
         <w:rPr>
-          <w:rFonts w:ascii="Times New Roman" w:eastAsiaTheme="minorHAnsi" w:hAnsi="Times New Roman"/>
+          <w:rFonts w:ascii="Times New Roman" w:eastAsia="Times New Roman" w:hAnsi="Times New Roman"/>
           <w:color w:val="000000"/>
           <w:sz w:val="24"/>
           <w:szCs w:val="24"/>
           <w:lang w:eastAsia="ru-RU"/>
         </w:rPr>
       </w:pPr>
-    </w:p>
-    <w:p>
-      <w:pPr>
-        <w:spacing w:line="240" w:lineRule="auto"/>
-        <w:jc w:val="both"/>
-        <w:rPr>
-          <w:rFonts w:ascii="Times" w:eastAsiaTheme="minorHAnsi" w:hAnsi="Times"/>
-          <w:b/>
-          <w:sz w:val="20"/>
-          <w:szCs w:val="20"/>
-          <w:lang w:eastAsia="ru-RU"/>
-        </w:rPr>
-      </w:pPr>
-    </w:p>
-    <w:p>
-      <w:pPr>
-        <w:pStyle w:val="a5"/>
-        <w:spacing w:before="0" w:beforeAutospacing="0" w:after="0" w:afterAutospacing="0"/>
-        <w:rPr>
-          <w:rFonts w:eastAsiaTheme="minorHAnsi"/>
-          <w:b/>
-          <w:i/>
-          <w:color w:val="000000"/>
-        </w:rPr>
-      </w:pPr>
-      <w:r>
-        <w:rPr>
-          <w:b/>
-          <w:color w:val="000000"/>
-        </w:rPr>
-        <w:t>Задание 2.3</w:t>
-      </w:r>
-      <w:r>
-        <w:rPr>
-          <w:b/>
-          <w:color w:val="000000"/>
-        </w:rPr>
-        <w:t xml:space="preserve">. </w:t>
-      </w:r>
-      <w:r>
-        <w:rPr>
-          <w:rFonts w:eastAsiaTheme="minorHAnsi"/>
-          <w:b/>
-          <w:i/>
-          <w:color w:val="000000"/>
-        </w:rPr>
-        <w:t>Определение технологий профессионального самообразования.</w:t>
-      </w:r>
-    </w:p>
-    <w:p>
-      <w:pPr>
-        <w:spacing w:after="0" w:line="240" w:lineRule="auto"/>
+      <w:r>
         <w:rPr>
           <w:rFonts w:ascii="Times New Roman" w:eastAsia="Times New Roman" w:hAnsi="Times New Roman"/>
-          <w:b/>
-          <w:i/>
           <w:color w:val="000000"/>
           <w:sz w:val="24"/>
           <w:szCs w:val="24"/>
           <w:lang w:eastAsia="ru-RU"/>
         </w:rPr>
-      </w:pPr>
-    </w:p>
-    <w:p>
-      <w:pPr>
-        <w:spacing w:after="0" w:line="240" w:lineRule="auto"/>
+        <w:t xml:space="preserve">Примечание: </w:t>
+      </w:r>
+      <w:r>
         <w:rPr>
           <w:rFonts w:ascii="Times New Roman" w:eastAsia="Times New Roman" w:hAnsi="Times New Roman"/>
           <w:color w:val="000000"/>
@@ -2597,25 +2866,6 @@
           <w:szCs w:val="24"/>
           <w:lang w:eastAsia="ru-RU"/>
         </w:rPr>
-      </w:pPr>
-      <w:r>
-        <w:rPr>
-          <w:rFonts w:ascii="Times New Roman" w:eastAsia="Times New Roman" w:hAnsi="Times New Roman"/>
-          <w:color w:val="000000"/>
-          <w:sz w:val="24"/>
-          <w:szCs w:val="24"/>
-          <w:lang w:eastAsia="ru-RU"/>
-        </w:rPr>
-        <w:t xml:space="preserve">Примечание: </w:t>
-      </w:r>
-      <w:r>
-        <w:rPr>
-          <w:rFonts w:ascii="Times New Roman" w:eastAsia="Times New Roman" w:hAnsi="Times New Roman"/>
-          <w:color w:val="000000"/>
-          <w:sz w:val="24"/>
-          <w:szCs w:val="24"/>
-          <w:lang w:eastAsia="ru-RU"/>
-        </w:rPr>
         <w:t>Перечень с комментариями</w:t>
       </w:r>
     </w:p>
@@ -2641,8 +2891,50 @@
         <w:t>QR-код задания (на GIT-репозиторий):</w:t>
       </w:r>
     </w:p>
-    <w:p/>
-    <w:p/>
+    <w:p>
+      <w:r>
+        <w:rPr>
+          <w:rFonts w:eastAsiaTheme="minorHAnsi"/>
+          <w:noProof/>
+          <w:color w:val="000000"/>
+        </w:rPr>
+        <w:drawing>
+          <wp:inline distT="0" distB="0" distL="0" distR="0" wp14:anchorId="59CCD58B" wp14:editId="22290C7D">
+            <wp:extent cx="2880000" cy="2880000"/>
+            <wp:effectExtent l="0" t="0" r="0" b="0"/>
+            <wp:docPr id="1651244645" name="Рисунок 2"/>
+            <wp:cNvGraphicFramePr>
+              <a:graphicFrameLocks xmlns:a="http://schemas.openxmlformats.org/drawingml/2006/main" noChangeAspect="1"/>
+            </wp:cNvGraphicFramePr>
+            <a:graphic xmlns:a="http://schemas.openxmlformats.org/drawingml/2006/main">
+              <a:graphicData uri="http://schemas.openxmlformats.org/drawingml/2006/picture">
+                <pic:pic xmlns:pic="http://schemas.openxmlformats.org/drawingml/2006/picture">
+                  <pic:nvPicPr>
+                    <pic:cNvPr id="1455799580" name="Рисунок 1455799580"/>
+                    <pic:cNvPicPr/>
+                  </pic:nvPicPr>
+                  <pic:blipFill>
+                    <a:blip r:embed="rId7"/>
+                    <a:stretch>
+                      <a:fillRect/>
+                    </a:stretch>
+                  </pic:blipFill>
+                  <pic:spPr>
+                    <a:xfrm>
+                      <a:off x="0" y="0"/>
+                      <a:ext cx="2880000" cy="2880000"/>
+                    </a:xfrm>
+                    <a:prstGeom prst="rect">
+                      <a:avLst/>
+                    </a:prstGeom>
+                  </pic:spPr>
+                </pic:pic>
+              </a:graphicData>
+            </a:graphic>
+          </wp:inline>
+        </w:drawing>
+      </w:r>
+    </w:p>
     <w:p/>
     <w:p>
       <w:pPr>

</xml_diff>